<commit_message>
radio buton in same lines
</commit_message>
<xml_diff>
--- a/ressources/template.docx
+++ b/ressources/template.docx
@@ -2,18 +2,6 @@
 <file path=word/document.xml><?xml version="1.0" encoding="utf-8"?>
 <w:document xmlns:o="urn:schemas-microsoft-com:office:office" xmlns:r="http://schemas.openxmlformats.org/officeDocument/2006/relationships" xmlns:v="urn:schemas-microsoft-com:vml" xmlns:w="http://schemas.openxmlformats.org/wordprocessingml/2006/main" xmlns:w10="urn:schemas-microsoft-com:office:word" xmlns:wp="http://schemas.openxmlformats.org/drawingml/2006/wordprocessingDrawing" xmlns:wps="http://schemas.microsoft.com/office/word/2010/wordprocessingShape" xmlns:wpg="http://schemas.microsoft.com/office/word/2010/wordprocessingGroup" xmlns:mc="http://schemas.openxmlformats.org/markup-compatibility/2006" xmlns:wp14="http://schemas.microsoft.com/office/word/2010/wordprocessingDrawing" xmlns:w14="http://schemas.microsoft.com/office/word/2010/wordml" xmlns:w15="http://schemas.microsoft.com/office/word/2012/wordml" mc:Ignorable="w14 wp14 w15">
   <w:body>
-    <w:p>
-      <w:pPr>
-        <w:pStyle w:val="Normal"/>
-        <w:spacing w:before="0" w:after="19"/>
-        <w:rPr>
-          <w:rFonts w:ascii="Calibri" w:hAnsi="Calibri"/>
-        </w:rPr>
-      </w:pPr>
-      <w:r>
-        <w:rPr/>
-      </w:r>
-    </w:p>
     <w:p>
       <w:pPr>
         <w:pStyle w:val="Normal"/>
@@ -118,10 +106,8 @@
       <w:pPr>
         <w:pStyle w:val="Normal"/>
         <w:rPr>
-          <w:rFonts w:ascii="Calibri" w:hAnsi="Calibri"/>
-          <w:color w:val="002060"/>
-          <w:sz w:val="18"/>
-          <w:szCs w:val="18"/>
+          <w:sz w:val="20"/>
+          <w:szCs w:val="20"/>
         </w:rPr>
       </w:pPr>
       <w:r>
@@ -132,8 +118,8 @@
           <w:i w:val="false"/>
           <w:iCs w:val="false"/>
           <w:color w:val="002060"/>
-          <w:sz w:val="18"/>
-          <w:szCs w:val="18"/>
+          <w:sz w:val="20"/>
+          <w:szCs w:val="20"/>
         </w:rPr>
         <w:t>{% for s in compétences %}</w:t>
       </w:r>
@@ -146,10 +132,8 @@
           <w:numId w:val="6"/>
         </w:numPr>
         <w:rPr>
-          <w:rFonts w:ascii="Calibri" w:hAnsi="Calibri"/>
-          <w:color w:val="002060"/>
-          <w:sz w:val="18"/>
-          <w:szCs w:val="18"/>
+          <w:sz w:val="20"/>
+          <w:szCs w:val="20"/>
         </w:rPr>
       </w:pPr>
       <w:r>
@@ -160,8 +144,8 @@
           <w:i w:val="false"/>
           <w:iCs w:val="false"/>
           <w:color w:val="002060"/>
-          <w:sz w:val="18"/>
-          <w:szCs w:val="18"/>
+          <w:sz w:val="20"/>
+          <w:szCs w:val="20"/>
         </w:rPr>
         <w:t>{{ s }}</w:t>
       </w:r>
@@ -170,10 +154,8 @@
       <w:pPr>
         <w:pStyle w:val="Normal"/>
         <w:rPr>
-          <w:rFonts w:ascii="Calibri" w:hAnsi="Calibri"/>
-          <w:color w:val="002060"/>
-          <w:sz w:val="18"/>
-          <w:szCs w:val="18"/>
+          <w:sz w:val="20"/>
+          <w:szCs w:val="20"/>
         </w:rPr>
       </w:pPr>
       <w:r>
@@ -184,8 +166,8 @@
           <w:i w:val="false"/>
           <w:iCs w:val="false"/>
           <w:color w:val="002060"/>
-          <w:sz w:val="18"/>
-          <w:szCs w:val="18"/>
+          <w:sz w:val="20"/>
+          <w:szCs w:val="20"/>
         </w:rPr>
         <w:t>{% endfor %}</w:t>
       </w:r>
@@ -269,15 +251,7 @@
                                 <w:b/>
                                 <w:color w:val="FFFFFF"/>
                               </w:rPr>
-                              <w:t>O</w:t>
-                            </w:r>
-                            <w:r>
-                              <w:rPr>
-                                <w:rFonts w:cs="Calibri" w:ascii="Open Sauce Sans Light" w:hAnsi="Open Sauce Sans Light"/>
-                                <w:b/>
-                                <w:color w:val="FFFFFF"/>
-                              </w:rPr>
-                              <w:t>UTILS</w:t>
+                              <w:t>OUTILS</w:t>
                             </w:r>
                           </w:p>
                         </w:txbxContent>
@@ -303,18 +277,16 @@
         <w:ind w:hanging="0" w:left="0" w:right="0"/>
         <w:jc w:val="left"/>
         <w:rPr>
+          <w:sz w:val="20"/>
+          <w:szCs w:val="20"/>
+        </w:rPr>
+      </w:pPr>
+      <w:r>
+        <w:rPr>
           <w:rFonts w:ascii="Calibri" w:hAnsi="Calibri"/>
           <w:color w:val="002060"/>
-          <w:sz w:val="18"/>
-          <w:szCs w:val="18"/>
-        </w:rPr>
-      </w:pPr>
-      <w:r>
-        <w:rPr>
-          <w:rFonts w:ascii="Calibri" w:hAnsi="Calibri"/>
-          <w:color w:val="002060"/>
-          <w:sz w:val="18"/>
-          <w:szCs w:val="18"/>
+          <w:sz w:val="20"/>
+          <w:szCs w:val="20"/>
         </w:rPr>
         <w:t>{% for l in Logiciels_par_titre %}</w:t>
       </w:r>
@@ -328,10 +300,8 @@
         </w:numPr>
         <w:jc w:val="left"/>
         <w:rPr>
-          <w:rFonts w:ascii="Calibri" w:hAnsi="Calibri"/>
-          <w:color w:val="002060"/>
-          <w:sz w:val="18"/>
-          <w:szCs w:val="18"/>
+          <w:sz w:val="20"/>
+          <w:szCs w:val="20"/>
         </w:rPr>
       </w:pPr>
       <w:r>
@@ -340,8 +310,8 @@
           <w:b/>
           <w:bCs/>
           <w:color w:val="002060"/>
-          <w:sz w:val="18"/>
-          <w:szCs w:val="18"/>
+          <w:sz w:val="20"/>
+          <w:szCs w:val="20"/>
         </w:rPr>
         <w:t>{{ l.titre }}:</w:t>
       </w:r>
@@ -349,8 +319,8 @@
         <w:rPr>
           <w:rFonts w:ascii="Calibri" w:hAnsi="Calibri"/>
           <w:color w:val="002060"/>
-          <w:sz w:val="18"/>
-          <w:szCs w:val="18"/>
+          <w:sz w:val="20"/>
+          <w:szCs w:val="20"/>
         </w:rPr>
         <w:t xml:space="preserve"> {{ l.logiciels_outils | join(', ') }}</w:t>
       </w:r>
@@ -361,18 +331,16 @@
         <w:ind w:hanging="0" w:left="0" w:right="0"/>
         <w:jc w:val="left"/>
         <w:rPr>
+          <w:sz w:val="20"/>
+          <w:szCs w:val="20"/>
+        </w:rPr>
+      </w:pPr>
+      <w:r>
+        <w:rPr>
           <w:rFonts w:ascii="Calibri" w:hAnsi="Calibri"/>
           <w:color w:val="002060"/>
-          <w:sz w:val="18"/>
-          <w:szCs w:val="18"/>
-        </w:rPr>
-      </w:pPr>
-      <w:r>
-        <w:rPr>
-          <w:rFonts w:ascii="Calibri" w:hAnsi="Calibri"/>
-          <w:color w:val="002060"/>
-          <w:sz w:val="18"/>
-          <w:szCs w:val="18"/>
+          <w:sz w:val="20"/>
+          <w:szCs w:val="20"/>
         </w:rPr>
         <w:t>{% endfor %}</w:t>
       </w:r>
@@ -482,18 +450,16 @@
         <w:pStyle w:val="Normal"/>
         <w:spacing w:before="0" w:after="19"/>
         <w:rPr>
+          <w:sz w:val="20"/>
+          <w:szCs w:val="20"/>
+        </w:rPr>
+      </w:pPr>
+      <w:r>
+        <w:rPr>
           <w:rFonts w:ascii="Calibri" w:hAnsi="Calibri"/>
           <w:color w:val="002060"/>
-          <w:sz w:val="18"/>
-          <w:szCs w:val="18"/>
-        </w:rPr>
-      </w:pPr>
-      <w:r>
-        <w:rPr>
-          <w:rFonts w:ascii="Calibri" w:hAnsi="Calibri"/>
-          <w:color w:val="002060"/>
-          <w:sz w:val="18"/>
-          <w:szCs w:val="18"/>
+          <w:sz w:val="20"/>
+          <w:szCs w:val="20"/>
         </w:rPr>
         <w:t>{% for sect in Secteurs_activites %}</w:t>
       </w:r>
@@ -507,18 +473,16 @@
         </w:numPr>
         <w:spacing w:before="0" w:after="19"/>
         <w:rPr>
+          <w:sz w:val="20"/>
+          <w:szCs w:val="20"/>
+        </w:rPr>
+      </w:pPr>
+      <w:r>
+        <w:rPr>
           <w:rFonts w:ascii="Calibri" w:hAnsi="Calibri"/>
           <w:color w:val="002060"/>
-          <w:sz w:val="18"/>
-          <w:szCs w:val="18"/>
-        </w:rPr>
-      </w:pPr>
-      <w:r>
-        <w:rPr>
-          <w:rFonts w:ascii="Calibri" w:hAnsi="Calibri"/>
-          <w:color w:val="002060"/>
-          <w:sz w:val="18"/>
-          <w:szCs w:val="18"/>
+          <w:sz w:val="20"/>
+          <w:szCs w:val="20"/>
         </w:rPr>
         <w:t>{{ sect }}</w:t>
       </w:r>
@@ -528,18 +492,16 @@
         <w:pStyle w:val="Normal"/>
         <w:spacing w:before="0" w:after="19"/>
         <w:rPr>
+          <w:sz w:val="20"/>
+          <w:szCs w:val="20"/>
+        </w:rPr>
+      </w:pPr>
+      <w:r>
+        <w:rPr>
           <w:rFonts w:ascii="Calibri" w:hAnsi="Calibri"/>
           <w:color w:val="002060"/>
-          <w:sz w:val="18"/>
-          <w:szCs w:val="18"/>
-        </w:rPr>
-      </w:pPr>
-      <w:r>
-        <w:rPr>
-          <w:rFonts w:ascii="Calibri" w:hAnsi="Calibri"/>
-          <w:color w:val="002060"/>
-          <w:sz w:val="18"/>
-          <w:szCs w:val="18"/>
+          <w:sz w:val="20"/>
+          <w:szCs w:val="20"/>
         </w:rPr>
         <w:t>{% endfor %}</w:t>
       </w:r>
@@ -647,83 +609,185 @@
       <w:pPr>
         <w:pStyle w:val="Normal"/>
         <w:rPr>
+          <w:sz w:val="20"/>
+          <w:szCs w:val="20"/>
+        </w:rPr>
+      </w:pPr>
+      <w:r>
+        <w:rPr>
           <w:rFonts w:ascii="Calibri" w:hAnsi="Calibri"/>
           <w:color w:val="002060"/>
-          <w:sz w:val="18"/>
-          <w:szCs w:val="18"/>
-        </w:rPr>
-      </w:pPr>
-      <w:r>
-        <w:rPr>
-          <w:rFonts w:ascii="Calibri" w:hAnsi="Calibri"/>
-          <w:color w:val="002060"/>
-          <w:sz w:val="18"/>
-          <w:szCs w:val="18"/>
-        </w:rPr>
-        <w:t>{% for dip in Diplomes %}</w:t>
+          <w:sz w:val="20"/>
+          <w:szCs w:val="20"/>
+        </w:rPr>
+        <w:t>{% for dip in Diplomes -%}</w:t>
       </w:r>
     </w:p>
     <w:p>
       <w:pPr>
         <w:pStyle w:val="Normal"/>
+        <w:numPr>
+          <w:ilvl w:val="0"/>
+          <w:numId w:val="9"/>
+        </w:numPr>
+        <w:rPr>
+          <w:b/>
+          <w:bCs/>
+          <w:sz w:val="20"/>
+          <w:szCs w:val="20"/>
+        </w:rPr>
+      </w:pPr>
+      <w:r>
         <w:rPr>
           <w:rFonts w:ascii="Calibri" w:hAnsi="Calibri"/>
+          <w:b/>
+          <w:bCs/>
           <w:color w:val="002060"/>
-          <w:sz w:val="18"/>
-          <w:szCs w:val="18"/>
-        </w:rPr>
-      </w:pPr>
-      <w:r>
-        <w:rPr>
-          <w:rFonts w:ascii="Calibri" w:hAnsi="Calibri"/>
-          <w:color w:val="002060"/>
-          <w:sz w:val="18"/>
-          <w:szCs w:val="18"/>
-        </w:rPr>
-        <w:t xml:space="preserve">• </w:t>
-      </w:r>
-      <w:r>
-        <w:rPr>
-          <w:rFonts w:ascii="Calibri" w:hAnsi="Calibri"/>
-          <w:color w:val="002060"/>
-          <w:sz w:val="18"/>
-          <w:szCs w:val="18"/>
-        </w:rPr>
-        <w:t>{{ dip.Titre }}{% if dip.Ecole %} {{ dip.Ecole }}{% endif %}{% if dip.Annee %} — {{ dip.Annee }}{% endif %}{% if dip.Lieu %} {{ dip.Lieu }}{% endif %}</w:t>
+          <w:sz w:val="20"/>
+          <w:szCs w:val="20"/>
+        </w:rPr>
+        <w:t>{{ dip.Titre }}</w:t>
       </w:r>
     </w:p>
     <w:p>
       <w:pPr>
         <w:pStyle w:val="Normal"/>
         <w:rPr>
+          <w:sz w:val="20"/>
+          <w:szCs w:val="20"/>
+        </w:rPr>
+      </w:pPr>
+      <w:r>
+        <w:rPr>
           <w:rFonts w:ascii="Calibri" w:hAnsi="Calibri"/>
           <w:color w:val="002060"/>
-          <w:sz w:val="18"/>
-          <w:szCs w:val="18"/>
-        </w:rPr>
-      </w:pPr>
-      <w:r>
-        <w:rPr/>
+          <w:sz w:val="20"/>
+          <w:szCs w:val="20"/>
+        </w:rPr>
+        <w:t>{%- if dip.Ecole %} {{ dip.Ecole }}{% endif %}</w:t>
       </w:r>
     </w:p>
     <w:p>
       <w:pPr>
         <w:pStyle w:val="Normal"/>
         <w:rPr>
+          <w:sz w:val="20"/>
+          <w:szCs w:val="20"/>
+        </w:rPr>
+      </w:pPr>
+      <w:r>
+        <w:rPr>
           <w:rFonts w:ascii="Calibri" w:hAnsi="Calibri"/>
           <w:color w:val="002060"/>
-          <w:sz w:val="18"/>
-          <w:szCs w:val="18"/>
+          <w:sz w:val="20"/>
+          <w:szCs w:val="20"/>
+        </w:rPr>
+        <w:t>{%- if dip.Annee %} — {{ dip.Annee }}{% endif %}</w:t>
+      </w:r>
+    </w:p>
+    <w:p>
+      <w:pPr>
+        <w:pStyle w:val="Normal"/>
+        <w:rPr>
+          <w:sz w:val="20"/>
+          <w:szCs w:val="20"/>
         </w:rPr>
       </w:pPr>
       <w:r>
         <w:rPr>
           <w:rFonts w:ascii="Calibri" w:hAnsi="Calibri"/>
           <w:color w:val="002060"/>
-          <w:sz w:val="18"/>
-          <w:szCs w:val="18"/>
+          <w:sz w:val="20"/>
+          <w:szCs w:val="20"/>
+        </w:rPr>
+        <w:t>{%- if dip.Lieu %} {{ dip.Lieu }}{% endif %}</w:t>
+      </w:r>
+    </w:p>
+    <w:p>
+      <w:pPr>
+        <w:pStyle w:val="Normal"/>
+        <w:rPr>
+          <w:sz w:val="20"/>
+          <w:szCs w:val="20"/>
+        </w:rPr>
+      </w:pPr>
+      <w:r>
+        <w:rPr>
+          <w:sz w:val="20"/>
+          <w:szCs w:val="20"/>
+        </w:rPr>
+      </w:r>
+    </w:p>
+    <w:p>
+      <w:pPr>
+        <w:pStyle w:val="Normal"/>
+        <w:rPr>
+          <w:sz w:val="20"/>
+          <w:szCs w:val="20"/>
+        </w:rPr>
+      </w:pPr>
+      <w:r>
+        <w:rPr>
+          <w:rFonts w:ascii="Calibri" w:hAnsi="Calibri"/>
+          <w:color w:val="002060"/>
+          <w:sz w:val="20"/>
+          <w:szCs w:val="20"/>
         </w:rPr>
         <w:t>{% endfor %}</w:t>
+      </w:r>
+    </w:p>
+    <w:p>
+      <w:pPr>
+        <w:pStyle w:val="BodyText"/>
+        <w:rPr>
+          <w:sz w:val="20"/>
+          <w:szCs w:val="20"/>
+        </w:rPr>
+      </w:pPr>
+      <w:r>
+        <w:rPr>
+          <w:rFonts w:ascii="Calibri" w:hAnsi="Calibri"/>
+          <w:b w:val="false"/>
+          <w:bCs w:val="false"/>
+          <w:color w:val="002060"/>
+          <w:sz w:val="20"/>
+          <w:szCs w:val="20"/>
+        </w:rPr>
+        <w:t xml:space="preserve">{% if </w:t>
+      </w:r>
+      <w:r>
+        <w:rPr>
+          <w:rFonts w:ascii="Calibri" w:hAnsi="Calibri"/>
+          <w:b w:val="false"/>
+          <w:bCs w:val="false"/>
+          <w:color w:val="002060"/>
+          <w:sz w:val="20"/>
+          <w:szCs w:val="20"/>
+        </w:rPr>
+        <w:t>Langues</w:t>
+      </w:r>
+      <w:r>
+        <w:rPr>
+          <w:rFonts w:ascii="Calibri" w:hAnsi="Calibri"/>
+          <w:b w:val="false"/>
+          <w:bCs w:val="false"/>
+          <w:color w:val="002060"/>
+          <w:sz w:val="20"/>
+          <w:szCs w:val="20"/>
+        </w:rPr>
+        <w:t xml:space="preserve"> %</w:t>
+      </w:r>
+      <w:r>
+        <w:rPr>
+          <w:rFonts w:ascii="Calibri" w:hAnsi="Calibri"/>
+          <w:b w:val="false"/>
+          <w:bCs w:val="false"/>
+          <w:color w:val="002060"/>
+          <w:sz w:val="20"/>
+          <w:szCs w:val="20"/>
+          <w:u w:val="none"/>
+        </w:rPr>
+        <w:t>}</w:t>
       </w:r>
     </w:p>
     <w:p>
@@ -829,18 +893,16 @@
       <w:pPr>
         <w:pStyle w:val="Normal"/>
         <w:rPr>
+          <w:sz w:val="20"/>
+          <w:szCs w:val="20"/>
+        </w:rPr>
+      </w:pPr>
+      <w:r>
+        <w:rPr>
           <w:rFonts w:ascii="Calibri" w:hAnsi="Calibri"/>
           <w:color w:val="002060"/>
-          <w:sz w:val="18"/>
-          <w:szCs w:val="18"/>
-        </w:rPr>
-      </w:pPr>
-      <w:r>
-        <w:rPr>
-          <w:rFonts w:ascii="Calibri" w:hAnsi="Calibri"/>
-          <w:color w:val="002060"/>
-          <w:sz w:val="18"/>
-          <w:szCs w:val="18"/>
+          <w:sz w:val="20"/>
+          <w:szCs w:val="20"/>
         </w:rPr>
         <w:t>{% for lang in Langues %}</w:t>
       </w:r>
@@ -853,18 +915,16 @@
           <w:numId w:val="8"/>
         </w:numPr>
         <w:rPr>
+          <w:sz w:val="20"/>
+          <w:szCs w:val="20"/>
+        </w:rPr>
+      </w:pPr>
+      <w:r>
+        <w:rPr>
           <w:rFonts w:ascii="Calibri" w:hAnsi="Calibri"/>
           <w:color w:val="002060"/>
-          <w:sz w:val="18"/>
-          <w:szCs w:val="18"/>
-        </w:rPr>
-      </w:pPr>
-      <w:r>
-        <w:rPr>
-          <w:rFonts w:ascii="Calibri" w:hAnsi="Calibri"/>
-          <w:color w:val="002060"/>
-          <w:sz w:val="18"/>
-          <w:szCs w:val="18"/>
+          <w:sz w:val="20"/>
+          <w:szCs w:val="20"/>
         </w:rPr>
         <w:t>{{ lang }}</w:t>
       </w:r>
@@ -873,39 +933,46 @@
       <w:pPr>
         <w:pStyle w:val="Normal"/>
         <w:rPr>
+          <w:sz w:val="20"/>
+          <w:szCs w:val="20"/>
+        </w:rPr>
+      </w:pPr>
+      <w:r>
+        <w:rPr>
           <w:rFonts w:ascii="Calibri" w:hAnsi="Calibri"/>
           <w:color w:val="002060"/>
-          <w:sz w:val="18"/>
-          <w:szCs w:val="18"/>
-        </w:rPr>
-      </w:pPr>
-      <w:r>
-        <w:rPr>
-          <w:rFonts w:ascii="Calibri" w:hAnsi="Calibri"/>
-          <w:color w:val="002060"/>
-          <w:sz w:val="18"/>
-          <w:szCs w:val="18"/>
+          <w:sz w:val="20"/>
+          <w:szCs w:val="20"/>
         </w:rPr>
         <w:t>{% endfor %}</w:t>
       </w:r>
     </w:p>
     <w:p>
       <w:pPr>
-        <w:pStyle w:val="Normal"/>
-        <w:rPr>
-          <w:rFonts w:ascii="Calibri" w:hAnsi="Calibri"/>
+        <w:pStyle w:val="BodyText"/>
+        <w:rPr>
+          <w:sz w:val="20"/>
+          <w:szCs w:val="20"/>
+        </w:rPr>
+      </w:pPr>
+      <w:r>
+        <w:rPr>
+          <w:rFonts w:cs="Calibri" w:ascii="Calibri" w:hAnsi="Calibri"/>
+          <w:b w:val="false"/>
+          <w:bCs w:val="false"/>
+          <w:i w:val="false"/>
+          <w:iCs w:val="false"/>
           <w:color w:val="002060"/>
-          <w:sz w:val="18"/>
-          <w:szCs w:val="18"/>
-        </w:rPr>
-      </w:pPr>
-      <w:r>
-        <w:rPr/>
+          <w:sz w:val="20"/>
+          <w:szCs w:val="20"/>
+          <w:u w:val="none"/>
+        </w:rPr>
+        <w:t>{% endif %}</w:t>
       </w:r>
     </w:p>
     <w:p>
       <w:pPr>
-        <w:pStyle w:val="BodyText"/>
+        <w:pStyle w:val="Normal"/>
         <w:rPr>
           <w:rFonts w:ascii="Calibri" w:hAnsi="Calibri"/>
         </w:rPr>
@@ -964,7 +1031,32 @@
                         <a:effectRef idx="0"/>
                         <a:fontRef idx="minor"/>
                       </wps:style>
-                      <wps:bodyPr/>
+                      <wps:txbx>
+                        <w:txbxContent>
+                          <w:p>
+                            <w:pPr>
+                              <w:pStyle w:val="Contenudecadre"/>
+                              <w:jc w:val="center"/>
+                              <w:rPr>
+                                <w:rFonts w:ascii="Open Sauce Sans Light" w:hAnsi="Open Sauce Sans Light" w:cs="Calibri"/>
+                                <w:b/>
+                                <w:color w:val="FFFFFF"/>
+                              </w:rPr>
+                            </w:pPr>
+                            <w:r>
+                              <w:rPr>
+                                <w:rFonts w:cs="Calibri" w:ascii="Open Sauce Sans Light" w:hAnsi="Open Sauce Sans Light"/>
+                                <w:b/>
+                                <w:color w:val="FFFFFF"/>
+                              </w:rPr>
+                              <w:t>EXPÉRIENCES PROFESSIONNELLES</w:t>
+                            </w:r>
+                          </w:p>
+                        </w:txbxContent>
+                      </wps:txbx>
+                      <wps:bodyPr anchor="t" upright="1">
+                        <a:noAutofit/>
+                      </wps:bodyPr>
                     </wps:wsp>
                   </a:graphicData>
                 </a:graphic>
@@ -981,10 +1073,8 @@
       <w:pPr>
         <w:pStyle w:val="BodyText"/>
         <w:rPr>
-          <w:rFonts w:ascii="Calibri" w:hAnsi="Calibri"/>
-          <w:color w:val="002060"/>
-          <w:sz w:val="18"/>
-          <w:szCs w:val="18"/>
+          <w:sz w:val="20"/>
+          <w:szCs w:val="20"/>
         </w:rPr>
       </w:pPr>
       <w:r>
@@ -995,8 +1085,8 @@
           <w:i w:val="false"/>
           <w:iCs w:val="false"/>
           <w:color w:val="002060"/>
-          <w:sz w:val="18"/>
-          <w:szCs w:val="18"/>
+          <w:sz w:val="20"/>
+          <w:szCs w:val="20"/>
         </w:rPr>
         <w:t>{% for exp in Experiences %}{{ exp.Nom_Entreprise }}\t\t{{ exp.Dates }}  {{ exp.Durée_expérience }}</w:t>
       </w:r>
@@ -1007,16 +1097,16 @@
         <w:rPr>
           <w:rFonts w:ascii="Calibri" w:hAnsi="Calibri"/>
           <w:color w:val="002060"/>
-          <w:sz w:val="18"/>
-          <w:szCs w:val="18"/>
+          <w:sz w:val="20"/>
+          <w:szCs w:val="20"/>
         </w:rPr>
       </w:pPr>
       <w:r>
         <w:rPr>
           <w:rFonts w:ascii="Calibri" w:hAnsi="Calibri"/>
           <w:color w:val="002060"/>
-          <w:sz w:val="18"/>
-          <w:szCs w:val="18"/>
+          <w:sz w:val="20"/>
+          <w:szCs w:val="20"/>
         </w:rPr>
         <mc:AlternateContent>
           <mc:Choice Requires="wps">
@@ -1084,10 +1174,8 @@
           <w:numId w:val="4"/>
         </w:numPr>
         <w:rPr>
-          <w:rFonts w:ascii="Calibri" w:hAnsi="Calibri"/>
-          <w:color w:val="002060"/>
-          <w:sz w:val="18"/>
-          <w:szCs w:val="18"/>
+          <w:sz w:val="20"/>
+          <w:szCs w:val="20"/>
         </w:rPr>
       </w:pPr>
       <w:r>
@@ -1096,8 +1184,8 @@
           <w:b/>
           <w:bCs/>
           <w:color w:val="002060"/>
-          <w:sz w:val="18"/>
-          <w:szCs w:val="18"/>
+          <w:sz w:val="20"/>
+          <w:szCs w:val="20"/>
         </w:rPr>
         <w:t>{{ exp.Poste }}</w:t>
       </w:r>
@@ -1106,10 +1194,8 @@
       <w:pPr>
         <w:pStyle w:val="BodyText"/>
         <w:rPr>
-          <w:rFonts w:ascii="Calibri" w:hAnsi="Calibri"/>
-          <w:color w:val="002060"/>
-          <w:sz w:val="18"/>
-          <w:szCs w:val="18"/>
+          <w:sz w:val="20"/>
+          <w:szCs w:val="20"/>
         </w:rPr>
       </w:pPr>
       <w:r>
@@ -1118,8 +1204,8 @@
           <w:b w:val="false"/>
           <w:bCs w:val="false"/>
           <w:color w:val="002060"/>
-          <w:sz w:val="18"/>
-          <w:szCs w:val="18"/>
+          <w:sz w:val="20"/>
+          <w:szCs w:val="20"/>
         </w:rPr>
         <w:t>{% if exp.Mission %</w:t>
       </w:r>
@@ -1129,8 +1215,8 @@
           <w:b w:val="false"/>
           <w:bCs w:val="false"/>
           <w:color w:val="002060"/>
-          <w:sz w:val="18"/>
-          <w:szCs w:val="18"/>
+          <w:sz w:val="20"/>
+          <w:szCs w:val="20"/>
           <w:u w:val="none"/>
         </w:rPr>
         <w:t>}</w:t>
@@ -1140,10 +1226,8 @@
       <w:pPr>
         <w:pStyle w:val="BodyText"/>
         <w:rPr>
-          <w:rFonts w:ascii="Calibri" w:hAnsi="Calibri"/>
-          <w:color w:val="002060"/>
-          <w:sz w:val="18"/>
-          <w:szCs w:val="18"/>
+          <w:sz w:val="20"/>
+          <w:szCs w:val="20"/>
         </w:rPr>
       </w:pPr>
       <w:r>
@@ -1152,8 +1236,8 @@
           <w:b/>
           <w:bCs/>
           <w:color w:val="002060"/>
-          <w:sz w:val="18"/>
-          <w:szCs w:val="18"/>
+          <w:sz w:val="20"/>
+          <w:szCs w:val="20"/>
           <w:u w:val="none"/>
         </w:rPr>
         <w:t>Mission :</w:t>
@@ -1164,8 +1248,8 @@
           <w:b w:val="false"/>
           <w:bCs w:val="false"/>
           <w:color w:val="002060"/>
-          <w:sz w:val="18"/>
-          <w:szCs w:val="18"/>
+          <w:sz w:val="20"/>
+          <w:szCs w:val="20"/>
           <w:u w:val="none"/>
         </w:rPr>
         <w:t xml:space="preserve"> </w:t>
@@ -1176,8 +1260,8 @@
           <w:b w:val="false"/>
           <w:bCs w:val="false"/>
           <w:color w:val="002060"/>
-          <w:sz w:val="18"/>
-          <w:szCs w:val="18"/>
+          <w:sz w:val="20"/>
+          <w:szCs w:val="20"/>
         </w:rPr>
         <w:t>{{ exp.Mission }}{% endif %}</w:t>
       </w:r>
@@ -1186,50 +1270,26 @@
       <w:pPr>
         <w:pStyle w:val="BodyText"/>
         <w:rPr>
+          <w:sz w:val="20"/>
+          <w:szCs w:val="20"/>
+        </w:rPr>
+      </w:pPr>
+      <w:r>
+        <w:rPr>
           <w:rFonts w:ascii="Calibri" w:hAnsi="Calibri"/>
           <w:color w:val="002060"/>
-          <w:sz w:val="18"/>
-          <w:szCs w:val="18"/>
-        </w:rPr>
-      </w:pPr>
-      <w:r>
-        <w:rPr>
-          <w:rFonts w:ascii="Calibri" w:hAnsi="Calibri"/>
-          <w:color w:val="002060"/>
-          <w:sz w:val="18"/>
-          <w:szCs w:val="18"/>
-        </w:rPr>
-        <w:t>{% for t in exp.Taches %}• {{ t }}</w:t>
+          <w:sz w:val="20"/>
+          <w:szCs w:val="20"/>
+        </w:rPr>
+        <w:t>{% for t in exp.Taches %}• {{ t }}{% endfor %}</w:t>
       </w:r>
     </w:p>
     <w:p>
       <w:pPr>
         <w:pStyle w:val="BodyText"/>
         <w:rPr>
-          <w:rFonts w:ascii="Calibri" w:hAnsi="Calibri"/>
-          <w:color w:val="002060"/>
-          <w:sz w:val="18"/>
-          <w:szCs w:val="18"/>
-        </w:rPr>
-      </w:pPr>
-      <w:r>
-        <w:rPr>
-          <w:rFonts w:ascii="Calibri" w:hAnsi="Calibri"/>
-          <w:color w:val="002060"/>
-          <w:sz w:val="18"/>
-          <w:szCs w:val="18"/>
-        </w:rPr>
-        <w:t>{% endfor %}</w:t>
-      </w:r>
-    </w:p>
-    <w:p>
-      <w:pPr>
-        <w:pStyle w:val="BodyText"/>
-        <w:rPr>
-          <w:rFonts w:ascii="Calibri" w:hAnsi="Calibri"/>
-          <w:color w:val="002060"/>
-          <w:sz w:val="18"/>
-          <w:szCs w:val="18"/>
+          <w:sz w:val="20"/>
+          <w:szCs w:val="20"/>
         </w:rPr>
       </w:pPr>
       <w:r>
@@ -1238,8 +1298,8 @@
           <w:b w:val="false"/>
           <w:bCs w:val="false"/>
           <w:color w:val="002060"/>
-          <w:sz w:val="18"/>
-          <w:szCs w:val="18"/>
+          <w:sz w:val="20"/>
+          <w:szCs w:val="20"/>
         </w:rPr>
         <w:t>{% if exp.Clients %}</w:t>
       </w:r>
@@ -1248,10 +1308,8 @@
       <w:pPr>
         <w:pStyle w:val="BodyText"/>
         <w:rPr>
-          <w:rFonts w:ascii="Calibri" w:hAnsi="Calibri"/>
-          <w:color w:val="002060"/>
-          <w:sz w:val="18"/>
-          <w:szCs w:val="18"/>
+          <w:sz w:val="20"/>
+          <w:szCs w:val="20"/>
         </w:rPr>
       </w:pPr>
       <w:r>
@@ -1260,8 +1318,8 @@
           <w:b/>
           <w:bCs/>
           <w:color w:val="002060"/>
-          <w:sz w:val="18"/>
-          <w:szCs w:val="18"/>
+          <w:sz w:val="20"/>
+          <w:szCs w:val="20"/>
         </w:rPr>
         <w:t xml:space="preserve">Clients: </w:t>
       </w:r>
@@ -1271,8 +1329,8 @@
           <w:b w:val="false"/>
           <w:bCs w:val="false"/>
           <w:color w:val="002060"/>
-          <w:sz w:val="18"/>
-          <w:szCs w:val="18"/>
+          <w:sz w:val="20"/>
+          <w:szCs w:val="20"/>
         </w:rPr>
         <w:t>{{ exp.Clients | join(', ') }}</w:t>
       </w:r>
@@ -1281,10 +1339,8 @@
       <w:pPr>
         <w:pStyle w:val="BodyText"/>
         <w:rPr>
-          <w:rFonts w:ascii="Calibri" w:hAnsi="Calibri"/>
-          <w:color w:val="002060"/>
-          <w:sz w:val="18"/>
-          <w:szCs w:val="18"/>
+          <w:sz w:val="20"/>
+          <w:szCs w:val="20"/>
         </w:rPr>
       </w:pPr>
       <w:r>
@@ -1293,8 +1349,8 @@
           <w:b w:val="false"/>
           <w:bCs w:val="false"/>
           <w:color w:val="002060"/>
-          <w:sz w:val="18"/>
-          <w:szCs w:val="18"/>
+          <w:sz w:val="20"/>
+          <w:szCs w:val="20"/>
         </w:rPr>
         <w:t>{% endif %}</w:t>
       </w:r>
@@ -1303,10 +1359,8 @@
       <w:pPr>
         <w:pStyle w:val="BodyText"/>
         <w:rPr>
-          <w:rFonts w:ascii="Calibri" w:hAnsi="Calibri"/>
-          <w:color w:val="002060"/>
-          <w:sz w:val="18"/>
-          <w:szCs w:val="18"/>
+          <w:sz w:val="20"/>
+          <w:szCs w:val="20"/>
         </w:rPr>
       </w:pPr>
       <w:r>
@@ -1317,8 +1371,8 @@
           <w:i w:val="false"/>
           <w:iCs w:val="false"/>
           <w:color w:val="002060"/>
-          <w:sz w:val="18"/>
-          <w:szCs w:val="18"/>
+          <w:sz w:val="20"/>
+          <w:szCs w:val="20"/>
           <w:u w:val="none"/>
         </w:rPr>
         <w:t>{% if exp.Logiciels_outils %}</w:t>
@@ -1328,10 +1382,8 @@
       <w:pPr>
         <w:pStyle w:val="BodyText"/>
         <w:rPr>
-          <w:rFonts w:ascii="Calibri" w:hAnsi="Calibri"/>
-          <w:color w:val="002060"/>
-          <w:sz w:val="18"/>
-          <w:szCs w:val="18"/>
+          <w:sz w:val="20"/>
+          <w:szCs w:val="20"/>
         </w:rPr>
       </w:pPr>
       <w:r>
@@ -1342,8 +1394,8 @@
           <w:i w:val="false"/>
           <w:iCs w:val="false"/>
           <w:color w:val="002060"/>
-          <w:sz w:val="18"/>
-          <w:szCs w:val="18"/>
+          <w:sz w:val="20"/>
+          <w:szCs w:val="20"/>
           <w:u w:val="none"/>
         </w:rPr>
         <w:t>Outils:</w:t>
@@ -1356,8 +1408,8 @@
           <w:i w:val="false"/>
           <w:iCs w:val="false"/>
           <w:color w:val="002060"/>
-          <w:sz w:val="18"/>
-          <w:szCs w:val="18"/>
+          <w:sz w:val="20"/>
+          <w:szCs w:val="20"/>
           <w:u w:val="none"/>
         </w:rPr>
         <w:t xml:space="preserve"> {{ exp.Logiciels_outils | join(', ') }}</w:t>
@@ -1366,11 +1418,10 @@
     <w:p>
       <w:pPr>
         <w:pStyle w:val="BodyText"/>
-        <w:rPr>
-          <w:rFonts w:ascii="Calibri" w:hAnsi="Calibri"/>
-          <w:color w:val="002060"/>
-          <w:sz w:val="18"/>
-          <w:szCs w:val="18"/>
+        <w:spacing w:before="0" w:after="120"/>
+        <w:rPr>
+          <w:sz w:val="20"/>
+          <w:szCs w:val="20"/>
         </w:rPr>
       </w:pPr>
       <w:r>
@@ -1381,47 +1432,11 @@
           <w:i w:val="false"/>
           <w:iCs w:val="false"/>
           <w:color w:val="002060"/>
-          <w:sz w:val="18"/>
-          <w:szCs w:val="18"/>
+          <w:sz w:val="20"/>
+          <w:szCs w:val="20"/>
           <w:u w:val="none"/>
         </w:rPr>
-        <w:t>{% endif %}</w:t>
-      </w:r>
-    </w:p>
-    <w:p>
-      <w:pPr>
-        <w:pStyle w:val="BodyText"/>
-        <w:spacing w:before="0" w:after="120"/>
-        <w:rPr>
-          <w:rFonts w:ascii="Calibri" w:hAnsi="Calibri"/>
-          <w:color w:val="002060"/>
-          <w:sz w:val="18"/>
-          <w:szCs w:val="18"/>
-        </w:rPr>
-      </w:pPr>
-      <w:r>
-        <w:rPr>
-          <w:rFonts w:ascii="Calibri" w:hAnsi="Calibri"/>
-          <w:color w:val="002060"/>
-          <w:sz w:val="18"/>
-          <w:szCs w:val="18"/>
-        </w:rPr>
-        <w:t>{% endfor %}</w:t>
-      </w:r>
-    </w:p>
-    <w:p>
-      <w:pPr>
-        <w:pStyle w:val="BodyText"/>
-        <w:spacing w:before="0" w:after="120"/>
-        <w:rPr>
-          <w:rFonts w:ascii="Calibri" w:hAnsi="Calibri"/>
-          <w:color w:val="002060"/>
-          <w:sz w:val="18"/>
-          <w:szCs w:val="18"/>
-        </w:rPr>
-      </w:pPr>
-      <w:r>
-        <w:rPr/>
+        <w:t>{% endif %}{% endfor %}</w:t>
       </w:r>
     </w:p>
     <w:sectPr>
@@ -2064,7 +2079,7 @@
         </mc:Fallback>
       </mc:AlternateContent>
       <w:drawing>
-        <wp:anchor behindDoc="0" distT="0" distB="0" distL="0" distR="0" simplePos="0" locked="0" layoutInCell="0" allowOverlap="1" relativeHeight="20">
+        <wp:anchor behindDoc="1" distT="0" distB="0" distL="0" distR="0" simplePos="0" locked="0" layoutInCell="0" allowOverlap="1" relativeHeight="20">
           <wp:simplePos x="0" y="0"/>
           <wp:positionH relativeFrom="column">
             <wp:posOffset>31115</wp:posOffset>
@@ -2072,7 +2087,7 @@
           <wp:positionV relativeFrom="paragraph">
             <wp:posOffset>33020</wp:posOffset>
           </wp:positionV>
-          <wp:extent cx="1336675" cy="701675"/>
+          <wp:extent cx="1474470" cy="774065"/>
           <wp:effectExtent l="0" t="0" r="0" b="0"/>
           <wp:wrapSquare wrapText="largest"/>
           <wp:docPr id="9" name="Image1" descr=""/>
@@ -2098,7 +2113,7 @@
                 <pic:spPr bwMode="auto">
                   <a:xfrm>
                     <a:off x="0" y="0"/>
-                    <a:ext cx="1336675" cy="701675"/>
+                    <a:ext cx="1474470" cy="774065"/>
                   </a:xfrm>
                   <a:prstGeom prst="rect">
                     <a:avLst/>
@@ -2215,7 +2230,7 @@
         </mc:Fallback>
       </mc:AlternateContent>
       <w:drawing>
-        <wp:anchor behindDoc="0" distT="0" distB="0" distL="0" distR="0" simplePos="0" locked="0" layoutInCell="0" allowOverlap="1" relativeHeight="20">
+        <wp:anchor behindDoc="1" distT="0" distB="0" distL="0" distR="0" simplePos="0" locked="0" layoutInCell="0" allowOverlap="1" relativeHeight="20">
           <wp:simplePos x="0" y="0"/>
           <wp:positionH relativeFrom="column">
             <wp:posOffset>31115</wp:posOffset>
@@ -2223,7 +2238,7 @@
           <wp:positionV relativeFrom="paragraph">
             <wp:posOffset>33020</wp:posOffset>
           </wp:positionV>
-          <wp:extent cx="1336675" cy="701675"/>
+          <wp:extent cx="1474470" cy="774065"/>
           <wp:effectExtent l="0" t="0" r="0" b="0"/>
           <wp:wrapSquare wrapText="largest"/>
           <wp:docPr id="11" name="Image1" descr=""/>
@@ -2249,7 +2264,7 @@
                 <pic:spPr bwMode="auto">
                   <a:xfrm>
                     <a:off x="0" y="0"/>
-                    <a:ext cx="1336675" cy="701675"/>
+                    <a:ext cx="1474470" cy="774065"/>
                   </a:xfrm>
                   <a:prstGeom prst="rect">
                     <a:avLst/>
@@ -3401,6 +3416,143 @@
     </w:lvl>
   </w:abstractNum>
   <w:abstractNum w:abstractNumId="9">
+    <w:lvl w:ilvl="0">
+      <w:start w:val="1"/>
+      <w:numFmt w:val="bullet"/>
+      <w:lvlText w:val=""/>
+      <w:lvlJc w:val="left"/>
+      <w:pPr>
+        <w:tabs>
+          <w:tab w:val="num" w:pos="720"/>
+        </w:tabs>
+        <w:ind w:left="720" w:hanging="360"/>
+      </w:pPr>
+      <w:rPr>
+        <w:rFonts w:ascii="Wingdings" w:hAnsi="Wingdings" w:cs="Wingdings" w:hint="default"/>
+      </w:rPr>
+    </w:lvl>
+    <w:lvl w:ilvl="1">
+      <w:start w:val="1"/>
+      <w:numFmt w:val="bullet"/>
+      <w:lvlText w:val=""/>
+      <w:lvlJc w:val="left"/>
+      <w:pPr>
+        <w:tabs>
+          <w:tab w:val="num" w:pos="1080"/>
+        </w:tabs>
+        <w:ind w:left="1080" w:hanging="360"/>
+      </w:pPr>
+      <w:rPr>
+        <w:rFonts w:ascii="Wingdings" w:hAnsi="Wingdings" w:cs="Wingdings" w:hint="default"/>
+      </w:rPr>
+    </w:lvl>
+    <w:lvl w:ilvl="2">
+      <w:start w:val="1"/>
+      <w:numFmt w:val="bullet"/>
+      <w:lvlText w:val=""/>
+      <w:lvlJc w:val="left"/>
+      <w:pPr>
+        <w:tabs>
+          <w:tab w:val="num" w:pos="1440"/>
+        </w:tabs>
+        <w:ind w:left="1440" w:hanging="360"/>
+      </w:pPr>
+      <w:rPr>
+        <w:rFonts w:ascii="Wingdings" w:hAnsi="Wingdings" w:cs="Wingdings" w:hint="default"/>
+      </w:rPr>
+    </w:lvl>
+    <w:lvl w:ilvl="3">
+      <w:start w:val="1"/>
+      <w:numFmt w:val="bullet"/>
+      <w:lvlText w:val=""/>
+      <w:lvlJc w:val="left"/>
+      <w:pPr>
+        <w:tabs>
+          <w:tab w:val="num" w:pos="1800"/>
+        </w:tabs>
+        <w:ind w:left="1800" w:hanging="360"/>
+      </w:pPr>
+      <w:rPr>
+        <w:rFonts w:ascii="Wingdings" w:hAnsi="Wingdings" w:cs="Wingdings" w:hint="default"/>
+      </w:rPr>
+    </w:lvl>
+    <w:lvl w:ilvl="4">
+      <w:start w:val="1"/>
+      <w:numFmt w:val="bullet"/>
+      <w:lvlText w:val=""/>
+      <w:lvlJc w:val="left"/>
+      <w:pPr>
+        <w:tabs>
+          <w:tab w:val="num" w:pos="2160"/>
+        </w:tabs>
+        <w:ind w:left="2160" w:hanging="360"/>
+      </w:pPr>
+      <w:rPr>
+        <w:rFonts w:ascii="Wingdings" w:hAnsi="Wingdings" w:cs="Wingdings" w:hint="default"/>
+      </w:rPr>
+    </w:lvl>
+    <w:lvl w:ilvl="5">
+      <w:start w:val="1"/>
+      <w:numFmt w:val="bullet"/>
+      <w:lvlText w:val=""/>
+      <w:lvlJc w:val="left"/>
+      <w:pPr>
+        <w:tabs>
+          <w:tab w:val="num" w:pos="2520"/>
+        </w:tabs>
+        <w:ind w:left="2520" w:hanging="360"/>
+      </w:pPr>
+      <w:rPr>
+        <w:rFonts w:ascii="Wingdings" w:hAnsi="Wingdings" w:cs="Wingdings" w:hint="default"/>
+      </w:rPr>
+    </w:lvl>
+    <w:lvl w:ilvl="6">
+      <w:start w:val="1"/>
+      <w:numFmt w:val="bullet"/>
+      <w:lvlText w:val=""/>
+      <w:lvlJc w:val="left"/>
+      <w:pPr>
+        <w:tabs>
+          <w:tab w:val="num" w:pos="2880"/>
+        </w:tabs>
+        <w:ind w:left="2880" w:hanging="360"/>
+      </w:pPr>
+      <w:rPr>
+        <w:rFonts w:ascii="Wingdings" w:hAnsi="Wingdings" w:cs="Wingdings" w:hint="default"/>
+      </w:rPr>
+    </w:lvl>
+    <w:lvl w:ilvl="7">
+      <w:start w:val="1"/>
+      <w:numFmt w:val="bullet"/>
+      <w:lvlText w:val=""/>
+      <w:lvlJc w:val="left"/>
+      <w:pPr>
+        <w:tabs>
+          <w:tab w:val="num" w:pos="3240"/>
+        </w:tabs>
+        <w:ind w:left="3240" w:hanging="360"/>
+      </w:pPr>
+      <w:rPr>
+        <w:rFonts w:ascii="Wingdings" w:hAnsi="Wingdings" w:cs="Wingdings" w:hint="default"/>
+      </w:rPr>
+    </w:lvl>
+    <w:lvl w:ilvl="8">
+      <w:start w:val="1"/>
+      <w:numFmt w:val="bullet"/>
+      <w:lvlText w:val=""/>
+      <w:lvlJc w:val="left"/>
+      <w:pPr>
+        <w:tabs>
+          <w:tab w:val="num" w:pos="3600"/>
+        </w:tabs>
+        <w:ind w:left="3600" w:hanging="360"/>
+      </w:pPr>
+      <w:rPr>
+        <w:rFonts w:ascii="Wingdings" w:hAnsi="Wingdings" w:cs="Wingdings" w:hint="default"/>
+      </w:rPr>
+    </w:lvl>
+  </w:abstractNum>
+  <w:abstractNum w:abstractNumId="10">
     <w:lvl w:ilvl="0">
       <w:start w:val="1"/>
       <w:numFmt w:val="none"/>
@@ -3545,6 +3697,9 @@
   </w:num>
   <w:num w:numId="9">
     <w:abstractNumId w:val="9"/>
+  </w:num>
+  <w:num w:numId="10">
+    <w:abstractNumId w:val="10"/>
   </w:num>
 </w:numbering>
 </file>

</xml_diff>

<commit_message>
update template and add buton o futur use case
</commit_message>
<xml_diff>
--- a/ressources/template.docx
+++ b/ressources/template.docx
@@ -2,18 +2,6 @@
 <file path=word/document.xml><?xml version="1.0" encoding="utf-8"?>
 <w:document xmlns:o="urn:schemas-microsoft-com:office:office" xmlns:r="http://schemas.openxmlformats.org/officeDocument/2006/relationships" xmlns:v="urn:schemas-microsoft-com:vml" xmlns:w="http://schemas.openxmlformats.org/wordprocessingml/2006/main" xmlns:w10="urn:schemas-microsoft-com:office:word" xmlns:wp="http://schemas.openxmlformats.org/drawingml/2006/wordprocessingDrawing" xmlns:wps="http://schemas.microsoft.com/office/word/2010/wordprocessingShape" xmlns:wpg="http://schemas.microsoft.com/office/word/2010/wordprocessingGroup" xmlns:mc="http://schemas.openxmlformats.org/markup-compatibility/2006" xmlns:wp14="http://schemas.microsoft.com/office/word/2010/wordprocessingDrawing" xmlns:w14="http://schemas.microsoft.com/office/word/2010/wordml" xmlns:w15="http://schemas.microsoft.com/office/word/2012/wordml" mc:Ignorable="w14 wp14 w15">
   <w:body>
-    <w:p>
-      <w:pPr>
-        <w:pStyle w:val="Normal"/>
-        <w:spacing w:before="0" w:after="19"/>
-        <w:rPr>
-          <w:rFonts w:ascii="Calibri" w:hAnsi="Calibri"/>
-        </w:rPr>
-      </w:pPr>
-      <w:r>
-        <w:rPr/>
-      </w:r>
-    </w:p>
     <w:p>
       <w:pPr>
         <w:pStyle w:val="Normal"/>
@@ -110,13 +98,16 @@
     <w:p>
       <w:pPr>
         <w:pStyle w:val="Normal"/>
-        <w:rPr/>
+        <w:rPr>
+          <w:sz w:val="18"/>
+          <w:szCs w:val="18"/>
+        </w:rPr>
       </w:pPr>
       <w:r>
         <w:rPr>
           <w:rFonts w:cs="Calibri" w:ascii="Calibri" w:hAnsi="Calibri"/>
-          <w:sz w:val="20"/>
-          <w:szCs w:val="20"/>
+          <w:sz w:val="18"/>
+          <w:szCs w:val="18"/>
         </w:rPr>
         <w:t>{% for s in compétences %}</w:t>
       </w:r>
@@ -128,13 +119,18 @@
           <w:ilvl w:val="0"/>
           <w:numId w:val="6"/>
         </w:numPr>
-        <w:rPr/>
+        <w:rPr>
+          <w:color w:val="002060"/>
+          <w:sz w:val="18"/>
+          <w:szCs w:val="18"/>
+        </w:rPr>
       </w:pPr>
       <w:r>
         <w:rPr>
           <w:rFonts w:cs="Calibri" w:ascii="Calibri" w:hAnsi="Calibri"/>
-          <w:sz w:val="20"/>
-          <w:szCs w:val="20"/>
+          <w:color w:val="002060"/>
+          <w:sz w:val="18"/>
+          <w:szCs w:val="18"/>
         </w:rPr>
         <w:t>{{ s }}</w:t>
       </w:r>
@@ -142,13 +138,16 @@
     <w:p>
       <w:pPr>
         <w:pStyle w:val="Normal"/>
-        <w:rPr/>
+        <w:rPr>
+          <w:sz w:val="18"/>
+          <w:szCs w:val="18"/>
+        </w:rPr>
       </w:pPr>
       <w:r>
         <w:rPr>
           <w:rFonts w:cs="Calibri" w:ascii="Calibri" w:hAnsi="Calibri"/>
-          <w:sz w:val="20"/>
-          <w:szCs w:val="20"/>
+          <w:sz w:val="18"/>
+          <w:szCs w:val="18"/>
         </w:rPr>
         <w:t>{% endfor %}</w:t>
       </w:r>
@@ -248,13 +247,16 @@
     <w:p>
       <w:pPr>
         <w:pStyle w:val="Normal"/>
-        <w:rPr/>
+        <w:rPr>
+          <w:sz w:val="18"/>
+          <w:szCs w:val="18"/>
+        </w:rPr>
       </w:pPr>
       <w:r>
         <w:rPr>
           <w:rFonts w:ascii="Calibri" w:hAnsi="Calibri"/>
-          <w:sz w:val="20"/>
-          <w:szCs w:val="20"/>
+          <w:sz w:val="18"/>
+          <w:szCs w:val="18"/>
         </w:rPr>
         <w:t>{% for l in Logiciels_par_titre %}</w:t>
       </w:r>
@@ -266,23 +268,29 @@
           <w:ilvl w:val="0"/>
           <w:numId w:val="5"/>
         </w:numPr>
-        <w:rPr/>
+        <w:rPr>
+          <w:color w:val="002060"/>
+          <w:sz w:val="18"/>
+          <w:szCs w:val="18"/>
+        </w:rPr>
       </w:pPr>
       <w:r>
         <w:rPr>
           <w:rFonts w:ascii="Calibri" w:hAnsi="Calibri"/>
           <w:b/>
           <w:bCs/>
-          <w:sz w:val="20"/>
-          <w:szCs w:val="20"/>
+          <w:color w:val="002060"/>
+          <w:sz w:val="18"/>
+          <w:szCs w:val="18"/>
         </w:rPr>
         <w:t>{{ l.titre }}:</w:t>
       </w:r>
       <w:r>
         <w:rPr>
           <w:rFonts w:ascii="Calibri" w:hAnsi="Calibri"/>
-          <w:sz w:val="20"/>
-          <w:szCs w:val="20"/>
+          <w:color w:val="002060"/>
+          <w:sz w:val="18"/>
+          <w:szCs w:val="18"/>
         </w:rPr>
         <w:t xml:space="preserve"> {{ l.logiciels_outils | join(', ') }}</w:t>
       </w:r>
@@ -290,13 +298,16 @@
     <w:p>
       <w:pPr>
         <w:pStyle w:val="Normal"/>
-        <w:rPr/>
+        <w:rPr>
+          <w:sz w:val="18"/>
+          <w:szCs w:val="18"/>
+        </w:rPr>
       </w:pPr>
       <w:r>
         <w:rPr>
           <w:rFonts w:ascii="Calibri" w:hAnsi="Calibri"/>
-          <w:sz w:val="20"/>
-          <w:szCs w:val="20"/>
+          <w:sz w:val="18"/>
+          <w:szCs w:val="18"/>
         </w:rPr>
         <w:t>{% endfor %}</w:t>
       </w:r>
@@ -398,13 +409,16 @@
       <w:pPr>
         <w:pStyle w:val="Normal"/>
         <w:spacing w:before="0" w:after="19"/>
-        <w:rPr/>
+        <w:rPr>
+          <w:sz w:val="18"/>
+          <w:szCs w:val="18"/>
+        </w:rPr>
       </w:pPr>
       <w:r>
         <w:rPr>
           <w:rFonts w:ascii="Calibri" w:hAnsi="Calibri"/>
-          <w:sz w:val="20"/>
-          <w:szCs w:val="20"/>
+          <w:sz w:val="18"/>
+          <w:szCs w:val="18"/>
         </w:rPr>
         <w:t>{% for sect in Secteurs_activites %}</w:t>
       </w:r>
@@ -417,13 +431,18 @@
           <w:numId w:val="7"/>
         </w:numPr>
         <w:spacing w:before="0" w:after="19"/>
-        <w:rPr/>
+        <w:rPr>
+          <w:color w:val="002060"/>
+          <w:sz w:val="18"/>
+          <w:szCs w:val="18"/>
+        </w:rPr>
       </w:pPr>
       <w:r>
         <w:rPr>
           <w:rFonts w:ascii="Calibri" w:hAnsi="Calibri"/>
-          <w:sz w:val="20"/>
-          <w:szCs w:val="20"/>
+          <w:color w:val="002060"/>
+          <w:sz w:val="18"/>
+          <w:szCs w:val="18"/>
         </w:rPr>
         <w:t>{{ sect }}</w:t>
       </w:r>
@@ -432,13 +451,16 @@
       <w:pPr>
         <w:pStyle w:val="Normal"/>
         <w:spacing w:before="0" w:after="19"/>
-        <w:rPr/>
+        <w:rPr>
+          <w:sz w:val="18"/>
+          <w:szCs w:val="18"/>
+        </w:rPr>
       </w:pPr>
       <w:r>
         <w:rPr>
           <w:rFonts w:ascii="Calibri" w:hAnsi="Calibri"/>
-          <w:sz w:val="20"/>
-          <w:szCs w:val="20"/>
+          <w:sz w:val="18"/>
+          <w:szCs w:val="18"/>
         </w:rPr>
         <w:t>{% endfor %}</w:t>
       </w:r>
@@ -538,13 +560,16 @@
     <w:p>
       <w:pPr>
         <w:pStyle w:val="Normal"/>
-        <w:rPr/>
+        <w:rPr>
+          <w:sz w:val="18"/>
+          <w:szCs w:val="18"/>
+        </w:rPr>
       </w:pPr>
       <w:r>
         <w:rPr>
           <w:rFonts w:ascii="Calibri" w:hAnsi="Calibri"/>
-          <w:sz w:val="20"/>
-          <w:szCs w:val="20"/>
+          <w:sz w:val="18"/>
+          <w:szCs w:val="18"/>
         </w:rPr>
         <w:t>{% for dip in Diplomes -%}</w:t>
       </w:r>
@@ -557,8 +582,9 @@
           <w:numId w:val="9"/>
         </w:numPr>
         <w:rPr>
-          <w:b/>
-          <w:bCs/>
+          <w:color w:val="002060"/>
+          <w:sz w:val="18"/>
+          <w:szCs w:val="18"/>
         </w:rPr>
       </w:pPr>
       <w:r>
@@ -566,8 +592,9 @@
           <w:rFonts w:ascii="Calibri" w:hAnsi="Calibri"/>
           <w:b/>
           <w:bCs/>
-          <w:sz w:val="20"/>
-          <w:szCs w:val="20"/>
+          <w:color w:val="002060"/>
+          <w:sz w:val="18"/>
+          <w:szCs w:val="18"/>
         </w:rPr>
         <w:t>{{ dip.Titre }}</w:t>
       </w:r>
@@ -575,70 +602,133 @@
     <w:p>
       <w:pPr>
         <w:pStyle w:val="Normal"/>
-        <w:rPr/>
+        <w:rPr>
+          <w:sz w:val="18"/>
+          <w:szCs w:val="18"/>
+        </w:rPr>
       </w:pPr>
       <w:r>
         <w:rPr>
           <w:rFonts w:ascii="Calibri" w:hAnsi="Calibri"/>
-          <w:sz w:val="20"/>
-          <w:szCs w:val="20"/>
-        </w:rPr>
-        <w:t>{%- if dip.Ecole %} {{ dip.Ecole }}{% endif %}</w:t>
+          <w:sz w:val="18"/>
+          <w:szCs w:val="18"/>
+        </w:rPr>
+        <w:t xml:space="preserve">{%- if dip.Ecole %} </w:t>
+      </w:r>
+      <w:r>
+        <w:rPr>
+          <w:rFonts w:ascii="Calibri" w:hAnsi="Calibri"/>
+          <w:color w:val="002060"/>
+          <w:sz w:val="18"/>
+          <w:szCs w:val="18"/>
+        </w:rPr>
+        <w:t>{{ dip.Ecole }}</w:t>
+      </w:r>
+      <w:r>
+        <w:rPr>
+          <w:rFonts w:ascii="Calibri" w:hAnsi="Calibri"/>
+          <w:sz w:val="18"/>
+          <w:szCs w:val="18"/>
+        </w:rPr>
+        <w:t>{% endif %}</w:t>
       </w:r>
     </w:p>
     <w:p>
       <w:pPr>
         <w:pStyle w:val="Normal"/>
-        <w:rPr/>
+        <w:rPr>
+          <w:sz w:val="18"/>
+          <w:szCs w:val="18"/>
+        </w:rPr>
       </w:pPr>
       <w:r>
         <w:rPr>
           <w:rFonts w:ascii="Calibri" w:hAnsi="Calibri"/>
-          <w:sz w:val="20"/>
-          <w:szCs w:val="20"/>
-        </w:rPr>
-        <w:t>{%- if dip.Annee %} — {{ dip.Annee }}{% endif %}</w:t>
+          <w:sz w:val="18"/>
+          <w:szCs w:val="18"/>
+        </w:rPr>
+        <w:t xml:space="preserve">{%- if dip.Annee %} — </w:t>
+      </w:r>
+      <w:r>
+        <w:rPr>
+          <w:rFonts w:ascii="Calibri" w:hAnsi="Calibri"/>
+          <w:color w:val="002060"/>
+          <w:sz w:val="18"/>
+          <w:szCs w:val="18"/>
+        </w:rPr>
+        <w:t>{{ dip.Annee }}</w:t>
+      </w:r>
+      <w:r>
+        <w:rPr>
+          <w:rFonts w:ascii="Calibri" w:hAnsi="Calibri"/>
+          <w:sz w:val="18"/>
+          <w:szCs w:val="18"/>
+        </w:rPr>
+        <w:t>{% endif %}</w:t>
       </w:r>
     </w:p>
     <w:p>
       <w:pPr>
         <w:pStyle w:val="Normal"/>
-        <w:rPr/>
+        <w:rPr>
+          <w:sz w:val="18"/>
+          <w:szCs w:val="18"/>
+        </w:rPr>
       </w:pPr>
       <w:r>
         <w:rPr>
           <w:rFonts w:ascii="Calibri" w:hAnsi="Calibri"/>
-          <w:sz w:val="20"/>
-          <w:szCs w:val="20"/>
-        </w:rPr>
-        <w:t>{%- if dip.Lieu %} {{ dip.Lieu }}{% endif %}</w:t>
+          <w:sz w:val="18"/>
+          <w:szCs w:val="18"/>
+        </w:rPr>
+        <w:t xml:space="preserve">{%- if dip.Lieu %} </w:t>
+      </w:r>
+      <w:r>
+        <w:rPr>
+          <w:rFonts w:ascii="Calibri" w:hAnsi="Calibri"/>
+          <w:color w:val="002060"/>
+          <w:sz w:val="18"/>
+          <w:szCs w:val="18"/>
+        </w:rPr>
+        <w:t>{{ dip.Lieu }}</w:t>
+      </w:r>
+      <w:r>
+        <w:rPr>
+          <w:rFonts w:ascii="Calibri" w:hAnsi="Calibri"/>
+          <w:sz w:val="18"/>
+          <w:szCs w:val="18"/>
+        </w:rPr>
+        <w:t>{% endif %}</w:t>
       </w:r>
     </w:p>
     <w:p>
       <w:pPr>
         <w:pStyle w:val="Normal"/>
         <w:rPr>
-          <w:sz w:val="20"/>
-          <w:szCs w:val="20"/>
-        </w:rPr>
-      </w:pPr>
-      <w:r>
-        <w:rPr>
-          <w:sz w:val="20"/>
-          <w:szCs w:val="20"/>
+          <w:sz w:val="18"/>
+          <w:szCs w:val="18"/>
+        </w:rPr>
+      </w:pPr>
+      <w:r>
+        <w:rPr>
+          <w:sz w:val="18"/>
+          <w:szCs w:val="18"/>
         </w:rPr>
       </w:r>
     </w:p>
     <w:p>
       <w:pPr>
         <w:pStyle w:val="Normal"/>
-        <w:rPr/>
+        <w:rPr>
+          <w:sz w:val="18"/>
+          <w:szCs w:val="18"/>
+        </w:rPr>
       </w:pPr>
       <w:r>
         <w:rPr>
           <w:rFonts w:ascii="Calibri" w:hAnsi="Calibri"/>
-          <w:sz w:val="20"/>
-          <w:szCs w:val="20"/>
+          <w:sz w:val="18"/>
+          <w:szCs w:val="18"/>
         </w:rPr>
         <w:t>{% endfor %}</w:t>
       </w:r>
@@ -646,13 +736,16 @@
     <w:p>
       <w:pPr>
         <w:pStyle w:val="BodyText"/>
-        <w:rPr/>
+        <w:rPr>
+          <w:sz w:val="18"/>
+          <w:szCs w:val="18"/>
+        </w:rPr>
       </w:pPr>
       <w:r>
         <w:rPr>
           <w:rFonts w:ascii="Calibri" w:hAnsi="Calibri"/>
-          <w:sz w:val="20"/>
-          <w:szCs w:val="20"/>
+          <w:sz w:val="18"/>
+          <w:szCs w:val="18"/>
         </w:rPr>
         <w:t>{% if Langues %}</w:t>
       </w:r>
@@ -752,13 +845,16 @@
     <w:p>
       <w:pPr>
         <w:pStyle w:val="Normal"/>
-        <w:rPr/>
+        <w:rPr>
+          <w:sz w:val="18"/>
+          <w:szCs w:val="18"/>
+        </w:rPr>
       </w:pPr>
       <w:r>
         <w:rPr>
           <w:rFonts w:ascii="Calibri" w:hAnsi="Calibri"/>
-          <w:sz w:val="20"/>
-          <w:szCs w:val="20"/>
+          <w:sz w:val="18"/>
+          <w:szCs w:val="18"/>
         </w:rPr>
         <w:t>{% for lang in Langues %}</w:t>
       </w:r>
@@ -770,13 +866,18 @@
           <w:ilvl w:val="0"/>
           <w:numId w:val="8"/>
         </w:numPr>
-        <w:rPr/>
+        <w:rPr>
+          <w:color w:val="002060"/>
+          <w:sz w:val="18"/>
+          <w:szCs w:val="18"/>
+        </w:rPr>
       </w:pPr>
       <w:r>
         <w:rPr>
           <w:rFonts w:ascii="Calibri" w:hAnsi="Calibri"/>
-          <w:sz w:val="20"/>
-          <w:szCs w:val="20"/>
+          <w:color w:val="002060"/>
+          <w:sz w:val="18"/>
+          <w:szCs w:val="18"/>
         </w:rPr>
         <w:t>{{ lang }}</w:t>
       </w:r>
@@ -784,13 +885,16 @@
     <w:p>
       <w:pPr>
         <w:pStyle w:val="Normal"/>
-        <w:rPr/>
+        <w:rPr>
+          <w:sz w:val="18"/>
+          <w:szCs w:val="18"/>
+        </w:rPr>
       </w:pPr>
       <w:r>
         <w:rPr>
           <w:rFonts w:ascii="Calibri" w:hAnsi="Calibri"/>
-          <w:sz w:val="20"/>
-          <w:szCs w:val="20"/>
+          <w:sz w:val="18"/>
+          <w:szCs w:val="18"/>
         </w:rPr>
         <w:t>{% endfor %}</w:t>
       </w:r>
@@ -799,15 +903,15 @@
       <w:pPr>
         <w:pStyle w:val="BodyText"/>
         <w:rPr>
-          <w:sz w:val="20"/>
-          <w:szCs w:val="20"/>
+          <w:sz w:val="18"/>
+          <w:szCs w:val="18"/>
         </w:rPr>
       </w:pPr>
       <w:r>
         <w:rPr>
           <w:rFonts w:cs="Calibri" w:ascii="Calibri" w:hAnsi="Calibri"/>
-          <w:sz w:val="20"/>
-          <w:szCs w:val="20"/>
+          <w:sz w:val="18"/>
+          <w:szCs w:val="18"/>
         </w:rPr>
         <w:t>{% endif %}</w:t>
       </w:r>
@@ -907,15 +1011,27 @@
     <w:p>
       <w:pPr>
         <w:pStyle w:val="BodyText"/>
-        <w:rPr/>
+        <w:rPr>
+          <w:sz w:val="18"/>
+          <w:szCs w:val="18"/>
+        </w:rPr>
       </w:pPr>
       <w:r>
         <w:rPr>
           <w:rFonts w:cs="Calibri" w:ascii="Calibri" w:hAnsi="Calibri"/>
-          <w:sz w:val="20"/>
-          <w:szCs w:val="20"/>
-        </w:rPr>
-        <w:t>{% for exp in Experiences %}| {{ exp.Nom_Entreprise }} | {{ exp.Dates }} — {{ exp.Durée_expérience }} |</w:t>
+          <w:sz w:val="18"/>
+          <w:szCs w:val="18"/>
+        </w:rPr>
+        <w:t xml:space="preserve">{% for exp in Experiences %}| </w:t>
+      </w:r>
+      <w:r>
+        <w:rPr>
+          <w:rFonts w:cs="Calibri" w:ascii="Calibri" w:hAnsi="Calibri"/>
+          <w:color w:val="002060"/>
+          <w:sz w:val="18"/>
+          <w:szCs w:val="18"/>
+        </w:rPr>
+        <w:t>{{ exp.Nom_Entreprise }} | {{ exp.Dates }} — {{ exp.Durée_expérience }} |</w:t>
       </w:r>
     </w:p>
     <w:p>
@@ -936,7 +1052,7 @@
         <mc:AlternateContent>
           <mc:Choice Requires="wps">
             <w:drawing>
-              <wp:anchor behindDoc="0" distT="635" distB="635" distL="635" distR="635" simplePos="0" locked="0" layoutInCell="1" allowOverlap="1" relativeHeight="21">
+              <wp:anchor behindDoc="0" distT="635" distB="635" distL="635" distR="635" simplePos="0" locked="0" layoutInCell="1" allowOverlap="1" relativeHeight="19">
                 <wp:simplePos x="0" y="0"/>
                 <wp:positionH relativeFrom="column">
                   <wp:posOffset>72390</wp:posOffset>
@@ -998,15 +1114,20 @@
           <w:ilvl w:val="0"/>
           <w:numId w:val="4"/>
         </w:numPr>
-        <w:rPr/>
+        <w:rPr>
+          <w:color w:val="002060"/>
+          <w:sz w:val="18"/>
+          <w:szCs w:val="18"/>
+        </w:rPr>
       </w:pPr>
       <w:r>
         <w:rPr>
           <w:rFonts w:ascii="Calibri" w:hAnsi="Calibri"/>
           <w:b/>
           <w:bCs/>
-          <w:sz w:val="20"/>
-          <w:szCs w:val="20"/>
+          <w:color w:val="002060"/>
+          <w:sz w:val="18"/>
+          <w:szCs w:val="18"/>
         </w:rPr>
         <w:t>{{ exp.Poste }}</w:t>
       </w:r>
@@ -1014,13 +1135,16 @@
     <w:p>
       <w:pPr>
         <w:pStyle w:val="BodyText"/>
-        <w:rPr/>
+        <w:rPr>
+          <w:sz w:val="18"/>
+          <w:szCs w:val="18"/>
+        </w:rPr>
       </w:pPr>
       <w:r>
         <w:rPr>
           <w:rFonts w:ascii="Calibri" w:hAnsi="Calibri"/>
-          <w:sz w:val="20"/>
-          <w:szCs w:val="20"/>
+          <w:sz w:val="18"/>
+          <w:szCs w:val="18"/>
         </w:rPr>
         <w:t>{% if exp.Mission %}</w:t>
       </w:r>
@@ -1029,9 +1153,8 @@
       <w:pPr>
         <w:pStyle w:val="BodyText"/>
         <w:rPr>
-          <w:rFonts w:ascii="Calibri" w:hAnsi="Calibri"/>
-          <w:sz w:val="20"/>
-          <w:szCs w:val="20"/>
+          <w:sz w:val="18"/>
+          <w:szCs w:val="18"/>
         </w:rPr>
       </w:pPr>
       <w:r>
@@ -1039,34 +1162,43 @@
           <w:rFonts w:ascii="Calibri" w:hAnsi="Calibri"/>
           <w:b/>
           <w:bCs/>
-          <w:sz w:val="20"/>
-          <w:szCs w:val="20"/>
+          <w:color w:val="002060"/>
+          <w:sz w:val="18"/>
+          <w:szCs w:val="18"/>
         </w:rPr>
         <w:t>Mission :</w:t>
       </w:r>
       <w:r>
         <w:rPr>
           <w:rFonts w:ascii="Calibri" w:hAnsi="Calibri"/>
-          <w:sz w:val="20"/>
-          <w:szCs w:val="20"/>
-        </w:rPr>
-        <w:t xml:space="preserve"> {{ exp.Mission }}{% endif %}</w:t>
+          <w:color w:val="002060"/>
+          <w:sz w:val="18"/>
+          <w:szCs w:val="18"/>
+        </w:rPr>
+        <w:t xml:space="preserve"> {{ exp.Mission }}</w:t>
+      </w:r>
+      <w:r>
+        <w:rPr>
+          <w:rFonts w:ascii="Calibri" w:hAnsi="Calibri"/>
+          <w:sz w:val="18"/>
+          <w:szCs w:val="18"/>
+        </w:rPr>
+        <w:t>{% endif %}</w:t>
       </w:r>
     </w:p>
     <w:p>
       <w:pPr>
         <w:pStyle w:val="BodyText"/>
         <w:rPr>
+          <w:sz w:val="18"/>
+          <w:szCs w:val="18"/>
+        </w:rPr>
+      </w:pPr>
+      <w:r>
+        <w:rPr>
           <w:rFonts w:ascii="Calibri" w:hAnsi="Calibri"/>
-          <w:sz w:val="20"/>
-          <w:szCs w:val="20"/>
-        </w:rPr>
-      </w:pPr>
-      <w:r>
-        <w:rPr>
-          <w:rFonts w:ascii="Calibri" w:hAnsi="Calibri"/>
-          <w:sz w:val="20"/>
-          <w:szCs w:val="20"/>
+          <w:sz w:val="18"/>
+          <w:szCs w:val="18"/>
         </w:rPr>
         <w:t>{% for t in exp.Taches %}- {{ t }}</w:t>
       </w:r>
@@ -1075,16 +1207,15 @@
       <w:pPr>
         <w:pStyle w:val="BodyText"/>
         <w:rPr>
+          <w:sz w:val="18"/>
+          <w:szCs w:val="18"/>
+        </w:rPr>
+      </w:pPr>
+      <w:r>
+        <w:rPr>
           <w:rFonts w:ascii="Calibri" w:hAnsi="Calibri"/>
-          <w:sz w:val="20"/>
-          <w:szCs w:val="20"/>
-        </w:rPr>
-      </w:pPr>
-      <w:r>
-        <w:rPr>
-          <w:rFonts w:ascii="Calibri" w:hAnsi="Calibri"/>
-          <w:sz w:val="20"/>
-          <w:szCs w:val="20"/>
+          <w:sz w:val="18"/>
+          <w:szCs w:val="18"/>
         </w:rPr>
         <w:t>{% endfor %}</w:t>
       </w:r>
@@ -1093,16 +1224,15 @@
       <w:pPr>
         <w:pStyle w:val="BodyText"/>
         <w:rPr>
+          <w:sz w:val="18"/>
+          <w:szCs w:val="18"/>
+        </w:rPr>
+      </w:pPr>
+      <w:r>
+        <w:rPr>
           <w:rFonts w:ascii="Calibri" w:hAnsi="Calibri"/>
-          <w:sz w:val="20"/>
-          <w:szCs w:val="20"/>
-        </w:rPr>
-      </w:pPr>
-      <w:r>
-        <w:rPr>
-          <w:rFonts w:ascii="Calibri" w:hAnsi="Calibri"/>
-          <w:sz w:val="20"/>
-          <w:szCs w:val="20"/>
+          <w:sz w:val="18"/>
+          <w:szCs w:val="18"/>
         </w:rPr>
         <w:t>{% if exp.Logiciels_outils %}</w:t>
       </w:r>
@@ -1111,9 +1241,9 @@
       <w:pPr>
         <w:pStyle w:val="BodyText"/>
         <w:rPr>
-          <w:rFonts w:ascii="Calibri" w:hAnsi="Calibri"/>
-          <w:sz w:val="20"/>
-          <w:szCs w:val="20"/>
+          <w:color w:val="002060"/>
+          <w:sz w:val="18"/>
+          <w:szCs w:val="18"/>
         </w:rPr>
       </w:pPr>
       <w:r>
@@ -1121,16 +1251,18 @@
           <w:rFonts w:ascii="Calibri" w:hAnsi="Calibri"/>
           <w:b/>
           <w:bCs/>
-          <w:sz w:val="20"/>
-          <w:szCs w:val="20"/>
+          <w:color w:val="002060"/>
+          <w:sz w:val="18"/>
+          <w:szCs w:val="18"/>
         </w:rPr>
         <w:t>Outils :</w:t>
       </w:r>
       <w:r>
         <w:rPr>
           <w:rFonts w:ascii="Calibri" w:hAnsi="Calibri"/>
-          <w:sz w:val="20"/>
-          <w:szCs w:val="20"/>
+          <w:color w:val="002060"/>
+          <w:sz w:val="18"/>
+          <w:szCs w:val="18"/>
         </w:rPr>
         <w:t xml:space="preserve"> {{ exp.Logiciels_outils | join(', ') }}</w:t>
       </w:r>
@@ -1139,16 +1271,15 @@
       <w:pPr>
         <w:pStyle w:val="BodyText"/>
         <w:rPr>
+          <w:sz w:val="18"/>
+          <w:szCs w:val="18"/>
+        </w:rPr>
+      </w:pPr>
+      <w:r>
+        <w:rPr>
           <w:rFonts w:ascii="Calibri" w:hAnsi="Calibri"/>
-          <w:sz w:val="20"/>
-          <w:szCs w:val="20"/>
-        </w:rPr>
-      </w:pPr>
-      <w:r>
-        <w:rPr>
-          <w:rFonts w:ascii="Calibri" w:hAnsi="Calibri"/>
-          <w:sz w:val="20"/>
-          <w:szCs w:val="20"/>
+          <w:sz w:val="18"/>
+          <w:szCs w:val="18"/>
         </w:rPr>
         <w:t>{% endif %}</w:t>
       </w:r>
@@ -1157,18 +1288,15 @@
       <w:pPr>
         <w:pStyle w:val="BodyText"/>
         <w:rPr>
-          <w:rFonts w:ascii="Calibri" w:hAnsi="Calibri" w:cs="Calibri"/>
-          <w:b/>
-          <w:bCs/>
-          <w:sz w:val="20"/>
-          <w:szCs w:val="20"/>
+          <w:sz w:val="18"/>
+          <w:szCs w:val="18"/>
         </w:rPr>
       </w:pPr>
       <w:r>
         <w:rPr>
           <w:rFonts w:ascii="Calibri" w:hAnsi="Calibri"/>
-          <w:sz w:val="20"/>
-          <w:szCs w:val="20"/>
+          <w:sz w:val="18"/>
+          <w:szCs w:val="18"/>
         </w:rPr>
         <w:t>{% if exp.Clients %}</w:t>
       </w:r>
@@ -1176,23 +1304,29 @@
     <w:p>
       <w:pPr>
         <w:pStyle w:val="BodyText"/>
-        <w:rPr/>
+        <w:rPr>
+          <w:color w:val="002060"/>
+          <w:sz w:val="18"/>
+          <w:szCs w:val="18"/>
+        </w:rPr>
       </w:pPr>
       <w:r>
         <w:rPr>
           <w:rFonts w:ascii="Calibri" w:hAnsi="Calibri"/>
           <w:b/>
           <w:bCs/>
-          <w:sz w:val="20"/>
-          <w:szCs w:val="20"/>
+          <w:color w:val="002060"/>
+          <w:sz w:val="18"/>
+          <w:szCs w:val="18"/>
         </w:rPr>
         <w:t xml:space="preserve">Clients : </w:t>
       </w:r>
       <w:r>
         <w:rPr>
           <w:rFonts w:ascii="Calibri" w:hAnsi="Calibri"/>
-          <w:sz w:val="20"/>
-          <w:szCs w:val="20"/>
+          <w:color w:val="002060"/>
+          <w:sz w:val="18"/>
+          <w:szCs w:val="18"/>
         </w:rPr>
         <w:t>{{ exp.Clients }}</w:t>
       </w:r>
@@ -1201,16 +1335,15 @@
       <w:pPr>
         <w:pStyle w:val="BodyText"/>
         <w:rPr>
+          <w:sz w:val="18"/>
+          <w:szCs w:val="18"/>
+        </w:rPr>
+      </w:pPr>
+      <w:r>
+        <w:rPr>
           <w:rFonts w:ascii="Calibri" w:hAnsi="Calibri"/>
-          <w:sz w:val="20"/>
-          <w:szCs w:val="20"/>
-        </w:rPr>
-      </w:pPr>
-      <w:r>
-        <w:rPr>
-          <w:rFonts w:ascii="Calibri" w:hAnsi="Calibri"/>
-          <w:sz w:val="20"/>
-          <w:szCs w:val="20"/>
+          <w:sz w:val="18"/>
+          <w:szCs w:val="18"/>
         </w:rPr>
         <w:t>{% endif %}</w:t>
       </w:r>
@@ -1220,16 +1353,15 @@
         <w:pStyle w:val="BodyText"/>
         <w:spacing w:before="0" w:after="120"/>
         <w:rPr>
+          <w:sz w:val="18"/>
+          <w:szCs w:val="18"/>
+        </w:rPr>
+      </w:pPr>
+      <w:r>
+        <w:rPr>
           <w:rFonts w:ascii="Calibri" w:hAnsi="Calibri"/>
-          <w:sz w:val="20"/>
-          <w:szCs w:val="20"/>
-        </w:rPr>
-      </w:pPr>
-      <w:r>
-        <w:rPr>
-          <w:rFonts w:ascii="Calibri" w:hAnsi="Calibri"/>
-          <w:sz w:val="20"/>
-          <w:szCs w:val="20"/>
+          <w:sz w:val="18"/>
+          <w:szCs w:val="18"/>
         </w:rPr>
         <w:t>{% endfor %}</w:t>
       </w:r>
@@ -1243,7 +1375,7 @@
       <w:footerReference w:type="first" r:id="rId7"/>
       <w:type w:val="nextPage"/>
       <w:pgSz w:w="11906" w:h="16838"/>
-      <w:pgMar w:left="709" w:right="748" w:gutter="0" w:header="283" w:top="850" w:footer="214" w:bottom="1274"/>
+      <w:pgMar w:left="709" w:right="748" w:gutter="0" w:header="283" w:top="2551" w:footer="214" w:bottom="1274"/>
       <w:pgNumType w:fmt="decimal"/>
       <w:formProt w:val="false"/>
       <w:textDirection w:val="lrTb"/>
@@ -1325,7 +1457,7 @@
       <mc:AlternateContent>
         <mc:Choice Requires="wps">
           <w:drawing>
-            <wp:anchor behindDoc="1" distT="635" distB="0" distL="635" distR="0" simplePos="0" locked="0" layoutInCell="0" allowOverlap="1" relativeHeight="15">
+            <wp:anchor behindDoc="1" distT="635" distB="0" distL="635" distR="0" simplePos="0" locked="0" layoutInCell="0" allowOverlap="1" relativeHeight="14">
               <wp:simplePos x="0" y="0"/>
               <wp:positionH relativeFrom="page">
                 <wp:posOffset>3596640</wp:posOffset>
@@ -1596,7 +1728,7 @@
       <mc:AlternateContent>
         <mc:Choice Requires="wps">
           <w:drawing>
-            <wp:anchor behindDoc="1" distT="635" distB="0" distL="635" distR="0" simplePos="0" locked="0" layoutInCell="0" allowOverlap="1" relativeHeight="15">
+            <wp:anchor behindDoc="1" distT="635" distB="0" distL="635" distR="0" simplePos="0" locked="0" layoutInCell="0" allowOverlap="1" relativeHeight="14">
               <wp:simplePos x="0" y="0"/>
               <wp:positionH relativeFrom="page">
                 <wp:posOffset>3596640</wp:posOffset>
@@ -1814,35 +1946,25 @@
       <w:pStyle w:val="Normal"/>
       <w:jc w:val="right"/>
       <w:rPr>
-        <w:rFonts w:ascii="Calibri" w:hAnsi="Calibri" w:cs="Calibri"/>
-        <w:b/>
-        <w:bCs/>
-        <w:sz w:val="28"/>
-        <w:szCs w:val="28"/>
+        <w:color w:val="002060"/>
+        <w:sz w:val="32"/>
+        <w:szCs w:val="32"/>
       </w:rPr>
     </w:pPr>
     <w:r>
       <w:drawing>
-        <wp:anchor behindDoc="0" distT="0" distB="0" distL="114300" distR="114300" simplePos="0" locked="0" layoutInCell="0" allowOverlap="1" relativeHeight="20">
+        <wp:anchor behindDoc="0" distT="0" distB="0" distL="0" distR="0" simplePos="0" locked="0" layoutInCell="0" allowOverlap="1" relativeHeight="20">
           <wp:simplePos x="0" y="0"/>
           <wp:positionH relativeFrom="column">
-            <wp:posOffset>205105</wp:posOffset>
+            <wp:posOffset>65405</wp:posOffset>
           </wp:positionH>
           <wp:positionV relativeFrom="paragraph">
-            <wp:posOffset>-82550</wp:posOffset>
+            <wp:posOffset>51435</wp:posOffset>
           </wp:positionV>
-          <wp:extent cx="698500" cy="741680"/>
+          <wp:extent cx="1543685" cy="1066800"/>
           <wp:effectExtent l="0" t="0" r="0" b="0"/>
-          <wp:wrapTight wrapText="bothSides">
-            <wp:wrapPolygon edited="0">
-              <wp:start x="-15" y="0"/>
-              <wp:lineTo x="-15" y="22754"/>
-              <wp:lineTo x="24216" y="22754"/>
-              <wp:lineTo x="24216" y="0"/>
-              <wp:lineTo x="-15" y="0"/>
-            </wp:wrapPolygon>
-          </wp:wrapTight>
-          <wp:docPr id="8" name="Image 1" descr=""/>
+          <wp:wrapSquare wrapText="largest"/>
+          <wp:docPr id="8" name="Image1" descr=""/>
           <wp:cNvGraphicFramePr>
             <a:graphicFrameLocks xmlns:a="http://schemas.openxmlformats.org/drawingml/2006/main" noChangeAspect="1"/>
           </wp:cNvGraphicFramePr>
@@ -1850,14 +1972,14 @@
             <a:graphicData uri="http://schemas.openxmlformats.org/drawingml/2006/picture">
               <pic:pic xmlns:pic="http://schemas.openxmlformats.org/drawingml/2006/picture">
                 <pic:nvPicPr>
-                  <pic:cNvPr id="8" name="Image 1" descr=""/>
+                  <pic:cNvPr id="8" name="Image1" descr=""/>
                   <pic:cNvPicPr>
                     <a:picLocks noChangeAspect="1" noChangeArrowheads="1"/>
                   </pic:cNvPicPr>
                 </pic:nvPicPr>
                 <pic:blipFill>
                   <a:blip r:embed="rId1"/>
-                  <a:srcRect l="0" t="0" r="12785" b="7190"/>
+                  <a:srcRect l="0" t="16859" r="3340" b="16339"/>
                   <a:stretch>
                     <a:fillRect/>
                   </a:stretch>
@@ -1865,7 +1987,7 @@
                 <pic:spPr bwMode="auto">
                   <a:xfrm>
                     <a:off x="0" y="0"/>
-                    <a:ext cx="698500" cy="741680"/>
+                    <a:ext cx="1543685" cy="1066800"/>
                   </a:xfrm>
                   <a:prstGeom prst="rect">
                     <a:avLst/>
@@ -1882,20 +2004,11 @@
         <w:rFonts w:cs="Calibri" w:ascii="Calibri" w:hAnsi="Calibri"/>
         <w:b/>
         <w:bCs/>
+        <w:color w:val="002060"/>
         <w:sz w:val="32"/>
         <w:szCs w:val="32"/>
       </w:rPr>
-      <w:t>{</w:t>
-    </w:r>
-    <w:r>
-      <w:rPr>
-        <w:rFonts w:cs="Calibri" w:ascii="Calibri" w:hAnsi="Calibri"/>
-        <w:b/>
-        <w:bCs/>
-        <w:sz w:val="28"/>
-        <w:szCs w:val="28"/>
-      </w:rPr>
-      <w:t>{Initial}}</w:t>
+      <w:t>{{Initial}}</w:t>
     </w:r>
   </w:p>
   <w:p>
@@ -1903,11 +2016,9 @@
       <w:pStyle w:val="Normal"/>
       <w:jc w:val="right"/>
       <w:rPr>
-        <w:rFonts w:ascii="Calibri" w:hAnsi="Calibri" w:cs="Calibri"/>
-        <w:b/>
-        <w:bCs/>
-        <w:sz w:val="28"/>
-        <w:szCs w:val="28"/>
+        <w:color w:val="002060"/>
+        <w:sz w:val="32"/>
+        <w:szCs w:val="32"/>
       </w:rPr>
     </w:pPr>
     <w:r>
@@ -1915,8 +2026,9 @@
         <w:rFonts w:cs="Calibri" w:ascii="Calibri" w:hAnsi="Calibri"/>
         <w:b/>
         <w:bCs/>
-        <w:sz w:val="28"/>
-        <w:szCs w:val="28"/>
+        <w:color w:val="002060"/>
+        <w:sz w:val="32"/>
+        <w:szCs w:val="32"/>
       </w:rPr>
       <w:t>{{POSTE}}</w:t>
     </w:r>
@@ -1926,11 +2038,9 @@
       <w:pStyle w:val="Normal"/>
       <w:jc w:val="right"/>
       <w:rPr>
-        <w:rFonts w:ascii="Calibri" w:hAnsi="Calibri" w:cs="Calibri"/>
-        <w:b/>
-        <w:bCs/>
-        <w:sz w:val="28"/>
-        <w:szCs w:val="28"/>
+        <w:color w:val="002060"/>
+        <w:sz w:val="32"/>
+        <w:szCs w:val="32"/>
       </w:rPr>
     </w:pPr>
     <w:r>
@@ -1938,8 +2048,9 @@
         <w:rFonts w:cs="Calibri" w:ascii="Calibri" w:hAnsi="Calibri"/>
         <w:b/>
         <w:bCs/>
-        <w:sz w:val="28"/>
-        <w:szCs w:val="28"/>
+        <w:color w:val="002060"/>
+        <w:sz w:val="32"/>
+        <w:szCs w:val="32"/>
       </w:rPr>
       <w:t>{{Experience_totale}}</w:t>
     </w:r>
@@ -1954,35 +2065,25 @@
       <w:pStyle w:val="Normal"/>
       <w:jc w:val="right"/>
       <w:rPr>
-        <w:rFonts w:ascii="Calibri" w:hAnsi="Calibri" w:cs="Calibri"/>
-        <w:b/>
-        <w:bCs/>
-        <w:sz w:val="28"/>
-        <w:szCs w:val="28"/>
+        <w:color w:val="002060"/>
+        <w:sz w:val="32"/>
+        <w:szCs w:val="32"/>
       </w:rPr>
     </w:pPr>
     <w:r>
       <w:drawing>
-        <wp:anchor behindDoc="0" distT="0" distB="0" distL="114300" distR="114300" simplePos="0" locked="0" layoutInCell="0" allowOverlap="1" relativeHeight="20">
+        <wp:anchor behindDoc="0" distT="0" distB="0" distL="0" distR="0" simplePos="0" locked="0" layoutInCell="0" allowOverlap="1" relativeHeight="20">
           <wp:simplePos x="0" y="0"/>
           <wp:positionH relativeFrom="column">
-            <wp:posOffset>205105</wp:posOffset>
+            <wp:posOffset>65405</wp:posOffset>
           </wp:positionH>
           <wp:positionV relativeFrom="paragraph">
-            <wp:posOffset>-82550</wp:posOffset>
+            <wp:posOffset>51435</wp:posOffset>
           </wp:positionV>
-          <wp:extent cx="698500" cy="741680"/>
+          <wp:extent cx="1543685" cy="1066800"/>
           <wp:effectExtent l="0" t="0" r="0" b="0"/>
-          <wp:wrapTight wrapText="bothSides">
-            <wp:wrapPolygon edited="0">
-              <wp:start x="-15" y="0"/>
-              <wp:lineTo x="-15" y="22754"/>
-              <wp:lineTo x="24216" y="22754"/>
-              <wp:lineTo x="24216" y="0"/>
-              <wp:lineTo x="-15" y="0"/>
-            </wp:wrapPolygon>
-          </wp:wrapTight>
-          <wp:docPr id="9" name="Image 1" descr=""/>
+          <wp:wrapSquare wrapText="largest"/>
+          <wp:docPr id="9" name="Image1" descr=""/>
           <wp:cNvGraphicFramePr>
             <a:graphicFrameLocks xmlns:a="http://schemas.openxmlformats.org/drawingml/2006/main" noChangeAspect="1"/>
           </wp:cNvGraphicFramePr>
@@ -1990,14 +2091,14 @@
             <a:graphicData uri="http://schemas.openxmlformats.org/drawingml/2006/picture">
               <pic:pic xmlns:pic="http://schemas.openxmlformats.org/drawingml/2006/picture">
                 <pic:nvPicPr>
-                  <pic:cNvPr id="9" name="Image 1" descr=""/>
+                  <pic:cNvPr id="9" name="Image1" descr=""/>
                   <pic:cNvPicPr>
                     <a:picLocks noChangeAspect="1" noChangeArrowheads="1"/>
                   </pic:cNvPicPr>
                 </pic:nvPicPr>
                 <pic:blipFill>
                   <a:blip r:embed="rId1"/>
-                  <a:srcRect l="0" t="0" r="12785" b="7190"/>
+                  <a:srcRect l="0" t="16859" r="3340" b="16339"/>
                   <a:stretch>
                     <a:fillRect/>
                   </a:stretch>
@@ -2005,7 +2106,7 @@
                 <pic:spPr bwMode="auto">
                   <a:xfrm>
                     <a:off x="0" y="0"/>
-                    <a:ext cx="698500" cy="741680"/>
+                    <a:ext cx="1543685" cy="1066800"/>
                   </a:xfrm>
                   <a:prstGeom prst="rect">
                     <a:avLst/>
@@ -2022,20 +2123,11 @@
         <w:rFonts w:cs="Calibri" w:ascii="Calibri" w:hAnsi="Calibri"/>
         <w:b/>
         <w:bCs/>
+        <w:color w:val="002060"/>
         <w:sz w:val="32"/>
         <w:szCs w:val="32"/>
       </w:rPr>
-      <w:t>{</w:t>
-    </w:r>
-    <w:r>
-      <w:rPr>
-        <w:rFonts w:cs="Calibri" w:ascii="Calibri" w:hAnsi="Calibri"/>
-        <w:b/>
-        <w:bCs/>
-        <w:sz w:val="28"/>
-        <w:szCs w:val="28"/>
-      </w:rPr>
-      <w:t>{Initial}}</w:t>
+      <w:t>{{Initial}}</w:t>
     </w:r>
   </w:p>
   <w:p>
@@ -2043,11 +2135,9 @@
       <w:pStyle w:val="Normal"/>
       <w:jc w:val="right"/>
       <w:rPr>
-        <w:rFonts w:ascii="Calibri" w:hAnsi="Calibri" w:cs="Calibri"/>
-        <w:b/>
-        <w:bCs/>
-        <w:sz w:val="28"/>
-        <w:szCs w:val="28"/>
+        <w:color w:val="002060"/>
+        <w:sz w:val="32"/>
+        <w:szCs w:val="32"/>
       </w:rPr>
     </w:pPr>
     <w:r>
@@ -2055,8 +2145,9 @@
         <w:rFonts w:cs="Calibri" w:ascii="Calibri" w:hAnsi="Calibri"/>
         <w:b/>
         <w:bCs/>
-        <w:sz w:val="28"/>
-        <w:szCs w:val="28"/>
+        <w:color w:val="002060"/>
+        <w:sz w:val="32"/>
+        <w:szCs w:val="32"/>
       </w:rPr>
       <w:t>{{POSTE}}</w:t>
     </w:r>
@@ -2066,11 +2157,9 @@
       <w:pStyle w:val="Normal"/>
       <w:jc w:val="right"/>
       <w:rPr>
-        <w:rFonts w:ascii="Calibri" w:hAnsi="Calibri" w:cs="Calibri"/>
-        <w:b/>
-        <w:bCs/>
-        <w:sz w:val="28"/>
-        <w:szCs w:val="28"/>
+        <w:color w:val="002060"/>
+        <w:sz w:val="32"/>
+        <w:szCs w:val="32"/>
       </w:rPr>
     </w:pPr>
     <w:r>
@@ -2078,8 +2167,9 @@
         <w:rFonts w:cs="Calibri" w:ascii="Calibri" w:hAnsi="Calibri"/>
         <w:b/>
         <w:bCs/>
-        <w:sz w:val="28"/>
-        <w:szCs w:val="28"/>
+        <w:color w:val="002060"/>
+        <w:sz w:val="32"/>
+        <w:szCs w:val="32"/>
       </w:rPr>
       <w:t>{{Experience_totale}}</w:t>
     </w:r>

</xml_diff>